<commit_message>
Refactors and updates the certificate to be more standardized.
</commit_message>
<xml_diff>
--- a/templates/свидетельство.docx
+++ b/templates/свидетельство.docx
@@ -2,30 +2,37 @@
 <file path=word/document.xml><?xml version="1.0" encoding="utf-8"?>
 <w:document xmlns:wpc="http://schemas.microsoft.com/office/word/2010/wordprocessingCanvas" xmlns:cx="http://schemas.microsoft.com/office/drawing/2014/chartex" xmlns:cx1="http://schemas.microsoft.com/office/drawing/2015/9/8/chartex" xmlns:cx2="http://schemas.microsoft.com/office/drawing/2015/10/21/chartex" xmlns:cx3="http://schemas.microsoft.com/office/drawing/2016/5/9/chartex" xmlns:cx4="http://schemas.microsoft.com/office/drawing/2016/5/10/chartex" xmlns:cx5="http://schemas.microsoft.com/office/drawing/2016/5/11/chartex" xmlns:cx6="http://schemas.microsoft.com/office/drawing/2016/5/12/chartex" xmlns:cx7="http://schemas.microsoft.com/office/drawing/2016/5/13/chartex" xmlns:cx8="http://schemas.microsoft.com/office/drawing/2016/5/14/chartex" xmlns:mc="http://schemas.openxmlformats.org/markup-compatibility/2006" xmlns:aink="http://schemas.microsoft.com/office/drawing/2016/ink" xmlns:am3d="http://schemas.microsoft.com/office/drawing/2017/model3d" xmlns:o="urn:schemas-microsoft-com:office:office" xmlns:oel="http://schemas.microsoft.com/office/2019/extlst" xmlns:r="http://schemas.openxmlformats.org/officeDocument/2006/relationships" xmlns:m="http://schemas.openxmlformats.org/officeDocument/2006/math" xmlns:v="urn:schemas-microsoft-com:vml" xmlns:wp14="http://schemas.microsoft.com/office/word/2010/wordprocessingDrawing" xmlns:wp="http://schemas.openxmlformats.org/drawingml/2006/wordprocessingDrawing" xmlns:w10="urn:schemas-microsoft-com:office:word" xmlns:w="http://schemas.openxmlformats.org/wordprocessingml/2006/main" xmlns:w14="http://schemas.microsoft.com/office/word/2010/wordml" xmlns:w15="http://schemas.microsoft.com/office/word/2012/wordml" xmlns:w16cex="http://schemas.microsoft.com/office/word/2018/wordml/cex" xmlns:w16cid="http://schemas.microsoft.com/office/word/2016/wordml/cid" xmlns:w16="http://schemas.microsoft.com/office/word/2018/wordml" xmlns:w16sdtdh="http://schemas.microsoft.com/office/word/2020/wordml/sdtdatahash" xmlns:w16se="http://schemas.microsoft.com/office/word/2015/wordml/symex" xmlns:wpg="http://schemas.microsoft.com/office/word/2010/wordprocessingGroup" xmlns:wpi="http://schemas.microsoft.com/office/word/2010/wordprocessingInk" xmlns:wne="http://schemas.microsoft.com/office/word/2006/wordml" xmlns:wps="http://schemas.microsoft.com/office/word/2010/wordprocessingShape" mc:Ignorable="w14 w15 w16se w16cid w16 w16cex w16sdtdh wp14">
   <w:body>
+    <w:p>
+      <w:pPr>
+        <w:rPr>
+          <w:rFonts w:ascii="Times New Roman" w:hAnsi="Times New Roman" w:cs="Times New Roman"/>
+          <w:sz w:val="24"/>
+          <w:szCs w:val="24"/>
+        </w:rPr>
+      </w:pPr>
+    </w:p>
     <w:tbl>
       <w:tblPr>
-        <w:tblStyle w:val="1"/>
+        <w:tblStyle w:val="TableGrid"/>
         <w:tblW w:w="0" w:type="auto"/>
         <w:tblLook w:val="04A0" w:firstRow="1" w:lastRow="0" w:firstColumn="1" w:lastColumn="0" w:noHBand="0" w:noVBand="1"/>
       </w:tblPr>
       <w:tblGrid>
-        <w:gridCol w:w="8051"/>
+        <w:gridCol w:w="8050"/>
       </w:tblGrid>
       <w:tr>
         <w:trPr>
-          <w:cantSplit/>
-          <w:trHeight w:hRule="exact" w:val="5387"/>
+          <w:trHeight w:hRule="exact" w:val="5386"/>
         </w:trPr>
         <w:tc>
           <w:tcPr>
-            <w:tcW w:w="8051" w:type="dxa"/>
+            <w:tcW w:w="8050" w:type="dxa"/>
           </w:tcPr>
           <w:p>
             <w:pPr>
-              <w:ind w:left="-113" w:right="-113" w:firstLine="284"/>
               <w:jc w:val="center"/>
               <w:rPr>
-                <w:rFonts w:ascii="Times New Roman" w:eastAsia="Calibri" w:hAnsi="Times New Roman" w:cs="Times New Roman"/>
+                <w:rFonts w:ascii="Times New Roman" w:hAnsi="Times New Roman" w:cs="Times New Roman"/>
                 <w:b/>
                 <w:bCs/>
                 <w:sz w:val="24"/>
@@ -34,89 +41,17 @@
             </w:pPr>
             <w:r>
               <w:rPr>
-                <w:rFonts w:ascii="Times New Roman" w:eastAsia="Calibri" w:hAnsi="Times New Roman" w:cs="Times New Roman"/>
-                <w:b/>
-                <w:bCs/>
-                <w:sz w:val="24"/>
-                <w:szCs w:val="24"/>
-              </w:rPr>
-              <w:t xml:space="preserve">ООО «Профессиональное   обучение»  </w:t>
-            </w:r>
-            <w:r>
-              <w:rPr>
-                <w:rFonts w:ascii="Times New Roman" w:eastAsia="Calibri" w:hAnsi="Times New Roman" w:cs="Times New Roman"/>
-                <w:noProof/>
-                <w:sz w:val="24"/>
-                <w:szCs w:val="24"/>
-                <w:lang w:eastAsia="ru-RU"/>
-              </w:rPr>
-              <w:drawing>
-                <wp:anchor distT="0" distB="0" distL="114300" distR="114300" simplePos="0" relativeHeight="251662336" behindDoc="1" locked="0" layoutInCell="1" allowOverlap="1" wp14:anchorId="0E357423" wp14:editId="3FD7E8DF">
-                  <wp:simplePos x="0" y="0"/>
-                  <wp:positionH relativeFrom="column">
-                    <wp:posOffset>-74589</wp:posOffset>
-                  </wp:positionH>
-                  <wp:positionV relativeFrom="paragraph">
-                    <wp:posOffset>6369</wp:posOffset>
-                  </wp:positionV>
-                  <wp:extent cx="5114925" cy="3400425"/>
-                  <wp:effectExtent l="0" t="0" r="9525" b="9525"/>
-                  <wp:wrapNone/>
-                  <wp:docPr id="1068604705" name="Рисунок 1068604705"/>
-                  <wp:cNvGraphicFramePr>
-                    <a:graphicFrameLocks xmlns:a="http://schemas.openxmlformats.org/drawingml/2006/main" noChangeAspect="1"/>
-                  </wp:cNvGraphicFramePr>
-                  <a:graphic xmlns:a="http://schemas.openxmlformats.org/drawingml/2006/main">
-                    <a:graphicData uri="http://schemas.openxmlformats.org/drawingml/2006/picture">
-                      <pic:pic xmlns:pic="http://schemas.openxmlformats.org/drawingml/2006/picture">
-                        <pic:nvPicPr>
-                          <pic:cNvPr id="0" name=""/>
-                          <pic:cNvPicPr/>
-                        </pic:nvPicPr>
-                        <pic:blipFill rotWithShape="1">
-                          <a:blip r:embed="rId5">
-                            <a:extLst>
-                              <a:ext uri="{28A0092B-C50C-407E-A947-70E740481C1C}">
-                                <a14:useLocalDpi xmlns:a14="http://schemas.microsoft.com/office/drawing/2010/main" val="0"/>
-                              </a:ext>
-                            </a:extLst>
-                          </a:blip>
-                          <a:srcRect r="16873" b="23179"/>
-                          <a:stretch/>
-                        </pic:blipFill>
-                        <pic:spPr bwMode="auto">
-                          <a:xfrm>
-                            <a:off x="0" y="0"/>
-                            <a:ext cx="5114925" cy="3400425"/>
-                          </a:xfrm>
-                          <a:prstGeom prst="rect">
-                            <a:avLst/>
-                          </a:prstGeom>
-                          <a:ln>
-                            <a:noFill/>
-                          </a:ln>
-                          <a:extLst>
-                            <a:ext uri="{53640926-AAD7-44D8-BBD7-CCE9431645EC}">
-                              <a14:shadowObscured xmlns:a14="http://schemas.microsoft.com/office/drawing/2010/main"/>
-                            </a:ext>
-                          </a:extLst>
-                        </pic:spPr>
-                      </pic:pic>
-                    </a:graphicData>
-                  </a:graphic>
-                  <wp14:sizeRelH relativeFrom="page">
-                    <wp14:pctWidth>0</wp14:pctWidth>
-                  </wp14:sizeRelH>
-                  <wp14:sizeRelV relativeFrom="page">
-                    <wp14:pctHeight>0</wp14:pctHeight>
-                  </wp14:sizeRelV>
-                </wp:anchor>
-              </w:drawing>
+                <w:rFonts w:ascii="Times New Roman" w:hAnsi="Times New Roman" w:cs="Times New Roman"/>
+                <w:b/>
+                <w:bCs/>
+                <w:sz w:val="24"/>
+                <w:szCs w:val="24"/>
+              </w:rPr>
+              <w:t>ООО «Профессиональное обучение»</w:t>
             </w:r>
           </w:p>
           <w:p>
             <w:pPr>
-              <w:ind w:left="-113" w:right="-113" w:firstLine="284"/>
               <w:jc w:val="center"/>
               <w:rPr>
                 <w:rFonts w:ascii="Times New Roman" w:hAnsi="Times New Roman" w:cs="Times New Roman"/>
@@ -134,94 +69,95 @@
                 <w:sz w:val="24"/>
                 <w:szCs w:val="24"/>
               </w:rPr>
-              <w:t>Республика Адыгея,</w:t>
-            </w:r>
-            <w:r>
-              <w:rPr>
-                <w:rFonts w:ascii="Times New Roman" w:hAnsi="Times New Roman" w:cs="Times New Roman"/>
-                <w:b/>
-                <w:bCs/>
-                <w:sz w:val="24"/>
-                <w:szCs w:val="24"/>
-              </w:rPr>
-              <w:t xml:space="preserve"> </w:t>
-            </w:r>
-            <w:r>
-              <w:rPr>
-                <w:rFonts w:ascii="Times New Roman" w:hAnsi="Times New Roman" w:cs="Times New Roman"/>
-                <w:b/>
-                <w:bCs/>
-                <w:sz w:val="24"/>
-                <w:szCs w:val="24"/>
-              </w:rPr>
-              <w:t>г. Майкоп, ул. Котовского, 13-А.</w:t>
+              <w:t>Республика Адыгея, г. Майкоп, ул. Котовского, 13-А.</w:t>
             </w:r>
           </w:p>
           <w:p>
             <w:pPr>
-              <w:pStyle w:val="Standard"/>
-              <w:spacing w:before="240"/>
-              <w:ind w:right="19"/>
               <w:jc w:val="center"/>
               <w:rPr>
-                <w:b/>
-                <w:bCs/>
+                <w:rFonts w:ascii="Times New Roman" w:hAnsi="Times New Roman" w:cs="Times New Roman"/>
+                <w:b/>
+                <w:bCs/>
+                <w:sz w:val="24"/>
+                <w:szCs w:val="24"/>
               </w:rPr>
             </w:pPr>
             <w:r>
               <w:rPr>
-                <w:b/>
-                <w:bCs/>
+                <w:rFonts w:ascii="Times New Roman" w:hAnsi="Times New Roman" w:cs="Times New Roman"/>
+                <w:b/>
+                <w:bCs/>
+                <w:sz w:val="24"/>
+                <w:szCs w:val="24"/>
               </w:rPr>
               <w:t>СВИДЕТЕЛЬСТВО</w:t>
             </w:r>
           </w:p>
           <w:p>
             <w:pPr>
-              <w:pStyle w:val="Heading2"/>
-              <w:numPr>
-                <w:ilvl w:val="1"/>
-                <w:numId w:val="2"/>
-              </w:numPr>
-              <w:ind w:right="19"/>
               <w:jc w:val="center"/>
               <w:rPr>
-                <w:sz w:val="24"/>
+                <w:rFonts w:ascii="Times New Roman" w:hAnsi="Times New Roman" w:cs="Times New Roman"/>
+                <w:b/>
+                <w:bCs/>
+                <w:sz w:val="24"/>
+                <w:szCs w:val="24"/>
               </w:rPr>
             </w:pPr>
             <w:r>
               <w:rPr>
-                <w:sz w:val="24"/>
-              </w:rPr>
-              <w:t xml:space="preserve">ПО № </w:t>
-            </w:r>
+                <w:rFonts w:ascii="Times New Roman" w:hAnsi="Times New Roman" w:cs="Times New Roman"/>
+                <w:b/>
+                <w:bCs/>
+                <w:sz w:val="24"/>
+                <w:szCs w:val="24"/>
+              </w:rPr>
+              <w:t>ПО</w:t>
+            </w:r>
+            <w:r>
+              <w:rPr>
+                <w:rFonts w:ascii="Times New Roman" w:hAnsi="Times New Roman" w:cs="Times New Roman"/>
+                <w:b/>
+                <w:bCs/>
+                <w:sz w:val="24"/>
+                <w:szCs w:val="24"/>
+              </w:rPr>
+              <w:t xml:space="preserve"> № {{ </w:t>
+            </w:r>
+            <w:proofErr w:type="spellStart"/>
             <w:proofErr w:type="gramStart"/>
             <w:r>
               <w:rPr>
-                <w:sz w:val="24"/>
-                <w:lang w:val="en-US"/>
-              </w:rPr>
-              <w:t xml:space="preserve">{{ </w:t>
+                <w:rFonts w:ascii="Times New Roman" w:hAnsi="Times New Roman" w:cs="Times New Roman"/>
+                <w:b/>
+                <w:bCs/>
+                <w:sz w:val="24"/>
+                <w:szCs w:val="24"/>
+                <w:lang w:val="en-US"/>
+              </w:rPr>
+              <w:t>certificate</w:t>
+            </w:r>
+            <w:proofErr w:type="spellEnd"/>
+            <w:proofErr w:type="gramEnd"/>
+            <w:r>
+              <w:rPr>
+                <w:rFonts w:ascii="Times New Roman" w:hAnsi="Times New Roman" w:cs="Times New Roman"/>
+                <w:b/>
+                <w:bCs/>
+                <w:sz w:val="24"/>
+                <w:szCs w:val="24"/>
+              </w:rPr>
+              <w:t>_</w:t>
             </w:r>
             <w:proofErr w:type="spellStart"/>
             <w:r>
               <w:rPr>
-                <w:sz w:val="24"/>
-                <w:lang w:val="en-US"/>
-              </w:rPr>
-              <w:t>certificate</w:t>
-            </w:r>
-            <w:proofErr w:type="gramEnd"/>
-            <w:r>
-              <w:rPr>
-                <w:sz w:val="24"/>
-                <w:lang w:val="en-US"/>
-              </w:rPr>
-              <w:t>_</w:t>
-            </w:r>
-            <w:r>
-              <w:rPr>
-                <w:sz w:val="24"/>
+                <w:rFonts w:ascii="Times New Roman" w:hAnsi="Times New Roman" w:cs="Times New Roman"/>
+                <w:b/>
+                <w:bCs/>
+                <w:sz w:val="24"/>
+                <w:szCs w:val="24"/>
                 <w:lang w:val="en-US"/>
               </w:rPr>
               <w:t>number</w:t>
@@ -229,103 +165,89 @@
             <w:proofErr w:type="spellEnd"/>
             <w:r>
               <w:rPr>
-                <w:sz w:val="24"/>
-                <w:lang w:val="en-US"/>
+                <w:rFonts w:ascii="Times New Roman" w:hAnsi="Times New Roman" w:cs="Times New Roman"/>
+                <w:b/>
+                <w:bCs/>
+                <w:sz w:val="24"/>
+                <w:szCs w:val="24"/>
+              </w:rPr>
+              <w:t xml:space="preserve"> }} – {{ </w:t>
+            </w:r>
+            <w:r>
+              <w:rPr>
+                <w:rFonts w:ascii="Times New Roman" w:hAnsi="Times New Roman" w:cs="Times New Roman"/>
+                <w:b/>
+                <w:bCs/>
+                <w:sz w:val="24"/>
+                <w:szCs w:val="24"/>
+                <w:lang w:val="en-US"/>
+              </w:rPr>
+              <w:t>year</w:t>
+            </w:r>
+            <w:r>
+              <w:rPr>
+                <w:rFonts w:ascii="Times New Roman" w:hAnsi="Times New Roman" w:cs="Times New Roman"/>
+                <w:b/>
+                <w:bCs/>
+                <w:sz w:val="24"/>
+                <w:szCs w:val="24"/>
               </w:rPr>
               <w:t xml:space="preserve"> }}</w:t>
-            </w:r>
-            <w:r>
-              <w:rPr>
-                <w:sz w:val="24"/>
-              </w:rPr>
-              <w:t>-</w:t>
-            </w:r>
-            <w:r>
-              <w:rPr>
-                <w:sz w:val="24"/>
-              </w:rPr>
-              <w:t>{{</w:t>
-            </w:r>
-            <w:r>
-              <w:rPr>
-                <w:sz w:val="24"/>
-                <w:lang w:val="en-US"/>
-              </w:rPr>
-              <w:t xml:space="preserve"> </w:t>
-            </w:r>
-            <w:proofErr w:type="spellStart"/>
-            <w:r>
-              <w:rPr>
-                <w:sz w:val="24"/>
-              </w:rPr>
-              <w:t>year</w:t>
-            </w:r>
-            <w:proofErr w:type="spellEnd"/>
-            <w:r>
-              <w:rPr>
-                <w:sz w:val="24"/>
-                <w:lang w:val="en-US"/>
-              </w:rPr>
-              <w:t xml:space="preserve"> </w:t>
-            </w:r>
-            <w:r>
-              <w:rPr>
-                <w:sz w:val="24"/>
-              </w:rPr>
-              <w:t>}}</w:t>
             </w:r>
           </w:p>
           <w:p>
             <w:pPr>
-              <w:pStyle w:val="Standard"/>
-              <w:ind w:right="19"/>
               <w:jc w:val="center"/>
               <w:rPr>
-                <w:b/>
-                <w:bCs/>
+                <w:rFonts w:ascii="Times New Roman" w:hAnsi="Times New Roman" w:cs="Times New Roman"/>
+                <w:b/>
+                <w:bCs/>
+                <w:sz w:val="24"/>
+                <w:szCs w:val="24"/>
               </w:rPr>
             </w:pPr>
             <w:r>
               <w:rPr>
-                <w:b/>
-                <w:bCs/>
-              </w:rPr>
-              <w:t xml:space="preserve">Настоящее свидетельство </w:t>
-            </w:r>
-            <w:r>
-              <w:rPr>
-                <w:b/>
-                <w:bCs/>
-              </w:rPr>
-              <w:t>подтверждает, что</w:t>
-            </w:r>
-            <w:r>
-              <w:rPr>
-                <w:b/>
-                <w:bCs/>
-              </w:rPr>
-              <w:t xml:space="preserve"> </w:t>
+                <w:rFonts w:ascii="Times New Roman" w:hAnsi="Times New Roman" w:cs="Times New Roman"/>
+                <w:b/>
+                <w:bCs/>
+                <w:sz w:val="24"/>
+                <w:szCs w:val="24"/>
+              </w:rPr>
+              <w:t>Настоящее свидетельство подтверждает, что</w:t>
             </w:r>
           </w:p>
           <w:p>
             <w:pPr>
-              <w:pStyle w:val="Standard"/>
-              <w:ind w:right="19"/>
               <w:jc w:val="center"/>
+              <w:rPr>
+                <w:rFonts w:ascii="Times New Roman" w:hAnsi="Times New Roman" w:cs="Times New Roman"/>
+                <w:b/>
+                <w:bCs/>
+                <w:sz w:val="24"/>
+                <w:szCs w:val="24"/>
+                <w:u w:val="single"/>
+              </w:rPr>
             </w:pPr>
             <w:proofErr w:type="gramStart"/>
             <w:r>
               <w:rPr>
-                <w:b/>
-                <w:bCs/>
+                <w:rFonts w:ascii="Times New Roman" w:hAnsi="Times New Roman" w:cs="Times New Roman"/>
+                <w:b/>
+                <w:bCs/>
+                <w:sz w:val="24"/>
+                <w:szCs w:val="24"/>
                 <w:u w:val="single"/>
               </w:rPr>
               <w:t xml:space="preserve">{{ </w:t>
             </w:r>
             <w:r>
               <w:rPr>
-                <w:b/>
-                <w:bCs/>
+                <w:rFonts w:ascii="Times New Roman" w:hAnsi="Times New Roman" w:cs="Times New Roman"/>
+                <w:b/>
+                <w:bCs/>
+                <w:sz w:val="24"/>
+                <w:szCs w:val="24"/>
                 <w:u w:val="single"/>
                 <w:lang w:val="en-US"/>
               </w:rPr>
@@ -334,16 +256,22 @@
             <w:proofErr w:type="gramEnd"/>
             <w:r>
               <w:rPr>
-                <w:b/>
-                <w:bCs/>
+                <w:rFonts w:ascii="Times New Roman" w:hAnsi="Times New Roman" w:cs="Times New Roman"/>
+                <w:b/>
+                <w:bCs/>
+                <w:sz w:val="24"/>
+                <w:szCs w:val="24"/>
                 <w:u w:val="single"/>
               </w:rPr>
               <w:t>_</w:t>
             </w:r>
             <w:r>
               <w:rPr>
-                <w:b/>
-                <w:bCs/>
+                <w:rFonts w:ascii="Times New Roman" w:hAnsi="Times New Roman" w:cs="Times New Roman"/>
+                <w:b/>
+                <w:bCs/>
+                <w:sz w:val="24"/>
+                <w:szCs w:val="24"/>
                 <w:u w:val="single"/>
                 <w:lang w:val="en-US"/>
               </w:rPr>
@@ -351,8 +279,11 @@
             </w:r>
             <w:r>
               <w:rPr>
-                <w:b/>
-                <w:bCs/>
+                <w:rFonts w:ascii="Times New Roman" w:hAnsi="Times New Roman" w:cs="Times New Roman"/>
+                <w:b/>
+                <w:bCs/>
+                <w:sz w:val="24"/>
+                <w:szCs w:val="24"/>
                 <w:u w:val="single"/>
               </w:rPr>
               <w:t xml:space="preserve"> }}</w:t>
@@ -360,173 +291,151 @@
           </w:p>
           <w:p>
             <w:pPr>
-              <w:pStyle w:val="Standard"/>
-              <w:ind w:right="19"/>
+              <w:ind w:right="123"/>
               <w:jc w:val="center"/>
+              <w:rPr>
+                <w:rFonts w:ascii="Times New Roman" w:hAnsi="Times New Roman" w:cs="Times New Roman"/>
+                <w:b/>
+                <w:bCs/>
+                <w:sz w:val="24"/>
+                <w:szCs w:val="24"/>
+              </w:rPr>
             </w:pPr>
             <w:r>
               <w:rPr>
-                <w:b/>
-                <w:bCs/>
-              </w:rPr>
-              <w:t>с</w:t>
-            </w:r>
-            <w:r>
-              <w:rPr>
-                <w:b/>
-                <w:bCs/>
-              </w:rPr>
-              <w:t xml:space="preserve"> {{ </w:t>
-            </w:r>
-            <w:r>
-              <w:rPr>
-                <w:b/>
-                <w:bCs/>
+                <w:rFonts w:ascii="Times New Roman" w:hAnsi="Times New Roman" w:cs="Times New Roman"/>
+                <w:b/>
+                <w:bCs/>
+                <w:sz w:val="24"/>
+                <w:szCs w:val="24"/>
+                <w:lang w:val="en-US"/>
+              </w:rPr>
+              <w:t>c</w:t>
+            </w:r>
+            <w:r>
+              <w:rPr>
+                <w:rFonts w:ascii="Times New Roman" w:hAnsi="Times New Roman" w:cs="Times New Roman"/>
+                <w:b/>
+                <w:bCs/>
+                <w:sz w:val="24"/>
+                <w:szCs w:val="24"/>
+              </w:rPr>
+              <w:t xml:space="preserve"> </w:t>
+            </w:r>
+            <w:proofErr w:type="gramStart"/>
+            <w:r>
+              <w:rPr>
+                <w:rFonts w:ascii="Times New Roman" w:hAnsi="Times New Roman" w:cs="Times New Roman"/>
+                <w:b/>
+                <w:bCs/>
+                <w:sz w:val="24"/>
+                <w:szCs w:val="24"/>
+              </w:rPr>
+              <w:t xml:space="preserve">{{ </w:t>
+            </w:r>
+            <w:r>
+              <w:rPr>
+                <w:rFonts w:ascii="Times New Roman" w:hAnsi="Times New Roman" w:cs="Times New Roman"/>
+                <w:b/>
+                <w:bCs/>
+                <w:sz w:val="24"/>
+                <w:szCs w:val="24"/>
                 <w:lang w:val="en-US"/>
               </w:rPr>
               <w:t>beginning</w:t>
             </w:r>
-            <w:r>
-              <w:rPr>
-                <w:b/>
-                <w:bCs/>
+            <w:proofErr w:type="gramEnd"/>
+            <w:r>
+              <w:rPr>
+                <w:rFonts w:ascii="Times New Roman" w:hAnsi="Times New Roman" w:cs="Times New Roman"/>
+                <w:b/>
+                <w:bCs/>
+                <w:sz w:val="24"/>
+                <w:szCs w:val="24"/>
               </w:rPr>
               <w:t>_</w:t>
             </w:r>
             <w:r>
               <w:rPr>
-                <w:b/>
-                <w:bCs/>
+                <w:rFonts w:ascii="Times New Roman" w:hAnsi="Times New Roman" w:cs="Times New Roman"/>
+                <w:b/>
+                <w:bCs/>
+                <w:sz w:val="24"/>
+                <w:szCs w:val="24"/>
                 <w:lang w:val="en-US"/>
               </w:rPr>
               <w:t>date</w:t>
             </w:r>
             <w:r>
               <w:rPr>
-                <w:b/>
-                <w:bCs/>
-              </w:rPr>
-              <w:t xml:space="preserve"> }}</w:t>
-            </w:r>
-            <w:r>
-              <w:rPr>
-                <w:b/>
-                <w:bCs/>
-              </w:rPr>
-              <w:t>поступил</w:t>
-            </w:r>
-            <w:r>
-              <w:rPr>
-                <w:b/>
-                <w:bCs/>
-              </w:rPr>
-              <w:t>(</w:t>
-            </w:r>
-            <w:r>
-              <w:rPr>
-                <w:b/>
-                <w:bCs/>
-              </w:rPr>
-              <w:t>а</w:t>
-            </w:r>
-            <w:r>
-              <w:rPr>
-                <w:b/>
-                <w:bCs/>
-              </w:rPr>
-              <w:t>)</w:t>
-            </w:r>
-            <w:r>
-              <w:rPr>
-                <w:b/>
-                <w:bCs/>
-              </w:rPr>
-              <w:t xml:space="preserve">  в  ООО «Профессиональное обучение» и</w:t>
-            </w:r>
-            <w:r>
-              <w:rPr>
-                <w:b/>
-                <w:bCs/>
-              </w:rPr>
-              <w:t xml:space="preserve"> {{ </w:t>
-            </w:r>
-            <w:r>
-              <w:rPr>
-                <w:b/>
-                <w:bCs/>
+                <w:rFonts w:ascii="Times New Roman" w:hAnsi="Times New Roman" w:cs="Times New Roman"/>
+                <w:b/>
+                <w:bCs/>
+                <w:sz w:val="24"/>
+                <w:szCs w:val="24"/>
+              </w:rPr>
+              <w:t xml:space="preserve"> }} поступил(а) в ООО «Профессиональное обучение» и {{ </w:t>
+            </w:r>
+            <w:r>
+              <w:rPr>
+                <w:rFonts w:ascii="Times New Roman" w:hAnsi="Times New Roman" w:cs="Times New Roman"/>
+                <w:b/>
+                <w:bCs/>
+                <w:sz w:val="24"/>
+                <w:szCs w:val="24"/>
                 <w:lang w:val="en-US"/>
               </w:rPr>
               <w:t>end</w:t>
             </w:r>
             <w:r>
               <w:rPr>
-                <w:b/>
-                <w:bCs/>
+                <w:rFonts w:ascii="Times New Roman" w:hAnsi="Times New Roman" w:cs="Times New Roman"/>
+                <w:b/>
+                <w:bCs/>
+                <w:sz w:val="24"/>
+                <w:szCs w:val="24"/>
               </w:rPr>
               <w:t>_</w:t>
             </w:r>
             <w:r>
               <w:rPr>
-                <w:b/>
-                <w:bCs/>
+                <w:rFonts w:ascii="Times New Roman" w:hAnsi="Times New Roman" w:cs="Times New Roman"/>
+                <w:b/>
+                <w:bCs/>
+                <w:sz w:val="24"/>
+                <w:szCs w:val="24"/>
                 <w:lang w:val="en-US"/>
               </w:rPr>
               <w:t>date</w:t>
             </w:r>
             <w:r>
               <w:rPr>
-                <w:b/>
-                <w:bCs/>
-              </w:rPr>
-              <w:t xml:space="preserve">}} </w:t>
-            </w:r>
-            <w:r>
-              <w:rPr>
-                <w:b/>
-                <w:bCs/>
-              </w:rPr>
-              <w:t>о</w:t>
-            </w:r>
-            <w:r>
-              <w:rPr>
-                <w:b/>
-                <w:bCs/>
-              </w:rPr>
-              <w:t>кончил</w:t>
-            </w:r>
-            <w:r>
-              <w:rPr>
-                <w:b/>
-                <w:bCs/>
-              </w:rPr>
-              <w:t>(а)</w:t>
-            </w:r>
-            <w:r>
-              <w:rPr>
-                <w:b/>
-                <w:bCs/>
-              </w:rPr>
-              <w:t xml:space="preserve"> </w:t>
-            </w:r>
-            <w:r>
-              <w:rPr>
-                <w:b/>
-                <w:bCs/>
-              </w:rPr>
-              <w:t xml:space="preserve">курсы по программе  профессиональной подготовки по профессии  </w:t>
-            </w:r>
-            <w:r>
-              <w:rPr>
-                <w:b/>
-                <w:bCs/>
+                <w:rFonts w:ascii="Times New Roman" w:hAnsi="Times New Roman" w:cs="Times New Roman"/>
+                <w:b/>
+                <w:bCs/>
+                <w:sz w:val="24"/>
+                <w:szCs w:val="24"/>
+              </w:rPr>
+              <w:t xml:space="preserve"> }} окончил(а) курсы по программе профессиональное подготовки по профессии </w:t>
+            </w:r>
+            <w:r>
+              <w:rPr>
+                <w:rFonts w:ascii="Times New Roman" w:hAnsi="Times New Roman" w:cs="Times New Roman"/>
+                <w:b/>
+                <w:bCs/>
+                <w:sz w:val="24"/>
+                <w:szCs w:val="24"/>
                 <w:u w:val="single"/>
               </w:rPr>
               <w:t xml:space="preserve">{{ </w:t>
             </w:r>
             <w:r>
               <w:rPr>
-                <w:b/>
-                <w:bCs/>
+                <w:rFonts w:ascii="Times New Roman" w:hAnsi="Times New Roman" w:cs="Times New Roman"/>
+                <w:b/>
+                <w:bCs/>
+                <w:sz w:val="24"/>
+                <w:szCs w:val="24"/>
                 <w:u w:val="single"/>
                 <w:lang w:val="en-US"/>
               </w:rPr>
@@ -534,16 +443,22 @@
             </w:r>
             <w:r>
               <w:rPr>
-                <w:b/>
-                <w:bCs/>
+                <w:rFonts w:ascii="Times New Roman" w:hAnsi="Times New Roman" w:cs="Times New Roman"/>
+                <w:b/>
+                <w:bCs/>
+                <w:sz w:val="24"/>
+                <w:szCs w:val="24"/>
                 <w:u w:val="single"/>
               </w:rPr>
               <w:t>_</w:t>
             </w:r>
             <w:r>
               <w:rPr>
-                <w:b/>
-                <w:bCs/>
+                <w:rFonts w:ascii="Times New Roman" w:hAnsi="Times New Roman" w:cs="Times New Roman"/>
+                <w:b/>
+                <w:bCs/>
+                <w:sz w:val="24"/>
+                <w:szCs w:val="24"/>
                 <w:u w:val="single"/>
                 <w:lang w:val="en-US"/>
               </w:rPr>
@@ -551,241 +466,270 @@
             </w:r>
             <w:r>
               <w:rPr>
-                <w:b/>
-                <w:bCs/>
-                <w:u w:val="single"/>
-              </w:rPr>
-              <w:t xml:space="preserve"> }}</w:t>
-            </w:r>
-            <w:r>
-              <w:rPr>
-                <w:b/>
-                <w:bCs/>
-                <w:u w:val="single"/>
-              </w:rPr>
-              <w:t>.</w:t>
+                <w:rFonts w:ascii="Times New Roman" w:hAnsi="Times New Roman" w:cs="Times New Roman"/>
+                <w:b/>
+                <w:bCs/>
+                <w:sz w:val="24"/>
+                <w:szCs w:val="24"/>
+                <w:u w:val="single"/>
+              </w:rPr>
+              <w:t xml:space="preserve"> }}.</w:t>
             </w:r>
           </w:p>
           <w:p>
             <w:pPr>
-              <w:pStyle w:val="Standard"/>
-              <w:ind w:right="19"/>
               <w:jc w:val="center"/>
               <w:rPr>
-                <w:b/>
-                <w:bCs/>
+                <w:rFonts w:ascii="Times New Roman" w:hAnsi="Times New Roman" w:cs="Times New Roman"/>
+                <w:b/>
+                <w:bCs/>
+                <w:sz w:val="24"/>
+                <w:szCs w:val="24"/>
               </w:rPr>
             </w:pPr>
             <w:r>
               <w:rPr>
-                <w:b/>
-                <w:bCs/>
+                <w:rFonts w:ascii="Times New Roman" w:hAnsi="Times New Roman" w:cs="Times New Roman"/>
+                <w:b/>
+                <w:bCs/>
+                <w:sz w:val="24"/>
+                <w:szCs w:val="24"/>
               </w:rPr>
               <w:t>Решением квалификационной комиссии</w:t>
             </w:r>
           </w:p>
           <w:p>
             <w:pPr>
-              <w:pStyle w:val="Standard"/>
-              <w:ind w:right="19"/>
               <w:jc w:val="center"/>
               <w:rPr>
-                <w:b/>
-                <w:bCs/>
-                <w:color w:val="FFFFFF"/>
-                <w:u w:val="single"/>
+                <w:rFonts w:ascii="Times New Roman" w:hAnsi="Times New Roman" w:cs="Times New Roman"/>
+                <w:b/>
+                <w:bCs/>
+                <w:sz w:val="24"/>
+                <w:szCs w:val="24"/>
               </w:rPr>
             </w:pPr>
             <w:r>
               <w:rPr>
-                <w:b/>
-                <w:bCs/>
+                <w:rFonts w:ascii="Times New Roman" w:hAnsi="Times New Roman" w:cs="Times New Roman"/>
+                <w:b/>
+                <w:bCs/>
+                <w:sz w:val="24"/>
+                <w:szCs w:val="24"/>
               </w:rPr>
               <w:t xml:space="preserve">от </w:t>
             </w:r>
-            <w:r>
-              <w:rPr>
-                <w:b/>
-                <w:bCs/>
+            <w:proofErr w:type="gramStart"/>
+            <w:r>
+              <w:rPr>
+                <w:rFonts w:ascii="Times New Roman" w:hAnsi="Times New Roman" w:cs="Times New Roman"/>
+                <w:b/>
+                <w:bCs/>
+                <w:sz w:val="24"/>
+                <w:szCs w:val="24"/>
               </w:rPr>
               <w:t xml:space="preserve">{{ </w:t>
             </w:r>
+            <w:r>
+              <w:rPr>
+                <w:rFonts w:ascii="Times New Roman" w:hAnsi="Times New Roman" w:cs="Times New Roman"/>
+                <w:b/>
+                <w:bCs/>
+                <w:sz w:val="24"/>
+                <w:szCs w:val="24"/>
+                <w:lang w:val="en-US"/>
+              </w:rPr>
+              <w:t>end</w:t>
+            </w:r>
+            <w:proofErr w:type="gramEnd"/>
+            <w:r>
+              <w:rPr>
+                <w:rFonts w:ascii="Times New Roman" w:hAnsi="Times New Roman" w:cs="Times New Roman"/>
+                <w:b/>
+                <w:bCs/>
+                <w:sz w:val="24"/>
+                <w:szCs w:val="24"/>
+              </w:rPr>
+              <w:t>_</w:t>
+            </w:r>
+            <w:r>
+              <w:rPr>
+                <w:rFonts w:ascii="Times New Roman" w:hAnsi="Times New Roman" w:cs="Times New Roman"/>
+                <w:b/>
+                <w:bCs/>
+                <w:sz w:val="24"/>
+                <w:szCs w:val="24"/>
+                <w:lang w:val="en-US"/>
+              </w:rPr>
+              <w:t>date</w:t>
+            </w:r>
+            <w:r>
+              <w:rPr>
+                <w:rFonts w:ascii="Times New Roman" w:hAnsi="Times New Roman" w:cs="Times New Roman"/>
+                <w:b/>
+                <w:bCs/>
+                <w:sz w:val="24"/>
+                <w:szCs w:val="24"/>
+              </w:rPr>
+              <w:t xml:space="preserve"> }} </w:t>
+            </w:r>
+            <w:r>
+              <w:rPr>
+                <w:rFonts w:ascii="Times New Roman" w:hAnsi="Times New Roman" w:cs="Times New Roman"/>
+                <w:b/>
+                <w:bCs/>
+                <w:sz w:val="24"/>
+                <w:szCs w:val="24"/>
+                <w:u w:val="single"/>
+              </w:rPr>
+              <w:t xml:space="preserve">{{ </w:t>
+            </w:r>
+            <w:r>
+              <w:rPr>
+                <w:rFonts w:ascii="Times New Roman" w:hAnsi="Times New Roman" w:cs="Times New Roman"/>
+                <w:b/>
+                <w:bCs/>
+                <w:sz w:val="24"/>
+                <w:szCs w:val="24"/>
+                <w:u w:val="single"/>
+                <w:lang w:val="en-US"/>
+              </w:rPr>
+              <w:t>student</w:t>
+            </w:r>
+            <w:r>
+              <w:rPr>
+                <w:rFonts w:ascii="Times New Roman" w:hAnsi="Times New Roman" w:cs="Times New Roman"/>
+                <w:b/>
+                <w:bCs/>
+                <w:sz w:val="24"/>
+                <w:szCs w:val="24"/>
+                <w:u w:val="single"/>
+              </w:rPr>
+              <w:t>_</w:t>
+            </w:r>
+            <w:r>
+              <w:rPr>
+                <w:rFonts w:ascii="Times New Roman" w:hAnsi="Times New Roman" w:cs="Times New Roman"/>
+                <w:b/>
+                <w:bCs/>
+                <w:sz w:val="24"/>
+                <w:szCs w:val="24"/>
+                <w:u w:val="single"/>
+                <w:lang w:val="en-US"/>
+              </w:rPr>
+              <w:t>name</w:t>
+            </w:r>
+            <w:r>
+              <w:rPr>
+                <w:rFonts w:ascii="Times New Roman" w:hAnsi="Times New Roman" w:cs="Times New Roman"/>
+                <w:b/>
+                <w:bCs/>
+                <w:sz w:val="24"/>
+                <w:szCs w:val="24"/>
+                <w:u w:val="single"/>
+              </w:rPr>
+              <w:t xml:space="preserve"> }}</w:t>
+            </w:r>
+            <w:r>
+              <w:rPr>
+                <w:rFonts w:ascii="Times New Roman" w:hAnsi="Times New Roman" w:cs="Times New Roman"/>
+                <w:b/>
+                <w:bCs/>
+                <w:sz w:val="24"/>
+                <w:szCs w:val="24"/>
+              </w:rPr>
+              <w:t xml:space="preserve"> получил(а) квалификацию </w:t>
+            </w:r>
+            <w:r>
+              <w:rPr>
+                <w:rFonts w:ascii="Times New Roman" w:hAnsi="Times New Roman" w:cs="Times New Roman"/>
+                <w:b/>
+                <w:bCs/>
+                <w:sz w:val="24"/>
+                <w:szCs w:val="24"/>
+                <w:u w:val="single"/>
+              </w:rPr>
+              <w:t xml:space="preserve">{{ </w:t>
+            </w:r>
             <w:proofErr w:type="spellStart"/>
             <w:r>
               <w:rPr>
-                <w:b/>
-                <w:bCs/>
-              </w:rPr>
-              <w:t>end_date</w:t>
+                <w:rFonts w:ascii="Times New Roman" w:hAnsi="Times New Roman" w:cs="Times New Roman"/>
+                <w:b/>
+                <w:bCs/>
+                <w:sz w:val="24"/>
+                <w:szCs w:val="24"/>
+                <w:u w:val="single"/>
+                <w:lang w:val="en-US"/>
+              </w:rPr>
+              <w:t>student</w:t>
             </w:r>
             <w:proofErr w:type="spellEnd"/>
             <w:r>
               <w:rPr>
-                <w:b/>
-                <w:bCs/>
-              </w:rPr>
-              <w:t xml:space="preserve">}} </w:t>
-            </w:r>
-            <w:r>
-              <w:rPr>
-                <w:b/>
-                <w:bCs/>
+                <w:rFonts w:ascii="Times New Roman" w:hAnsi="Times New Roman" w:cs="Times New Roman"/>
+                <w:b/>
+                <w:bCs/>
+                <w:sz w:val="24"/>
+                <w:szCs w:val="24"/>
+                <w:u w:val="single"/>
+              </w:rPr>
+              <w:t>_</w:t>
+            </w:r>
+            <w:proofErr w:type="spellStart"/>
+            <w:r>
+              <w:rPr>
+                <w:rFonts w:ascii="Times New Roman" w:hAnsi="Times New Roman" w:cs="Times New Roman"/>
+                <w:b/>
+                <w:bCs/>
+                <w:sz w:val="24"/>
+                <w:szCs w:val="24"/>
+                <w:u w:val="single"/>
+                <w:lang w:val="en-US"/>
+              </w:rPr>
+              <w:t>profession</w:t>
+            </w:r>
+            <w:proofErr w:type="spellEnd"/>
+            <w:r>
+              <w:rPr>
+                <w:rFonts w:ascii="Times New Roman" w:hAnsi="Times New Roman" w:cs="Times New Roman"/>
+                <w:b/>
+                <w:bCs/>
+                <w:sz w:val="24"/>
+                <w:szCs w:val="24"/>
+                <w:u w:val="single"/>
+              </w:rPr>
+              <w:t xml:space="preserve"> }}</w:t>
+            </w:r>
+            <w:r>
+              <w:rPr>
+                <w:rFonts w:ascii="Times New Roman" w:hAnsi="Times New Roman" w:cs="Times New Roman"/>
+                <w:b/>
+                <w:bCs/>
+                <w:sz w:val="24"/>
+                <w:szCs w:val="24"/>
+                <w:u w:val="single"/>
+              </w:rPr>
+              <w:t xml:space="preserve">, </w:t>
+            </w:r>
+            <w:r>
+              <w:rPr>
+                <w:rFonts w:ascii="Times New Roman" w:hAnsi="Times New Roman" w:cs="Times New Roman"/>
+                <w:b/>
+                <w:bCs/>
+                <w:sz w:val="24"/>
+                <w:szCs w:val="24"/>
                 <w:u w:val="single"/>
               </w:rPr>
               <w:t xml:space="preserve">{{ </w:t>
             </w:r>
             <w:r>
               <w:rPr>
-                <w:b/>
-                <w:bCs/>
-                <w:u w:val="single"/>
-                <w:lang w:val="en-US"/>
-              </w:rPr>
-              <w:t>student</w:t>
-            </w:r>
-            <w:r>
-              <w:rPr>
-                <w:b/>
-                <w:bCs/>
-                <w:u w:val="single"/>
-              </w:rPr>
-              <w:t>_</w:t>
-            </w:r>
-            <w:r>
-              <w:rPr>
-                <w:b/>
-                <w:bCs/>
-                <w:u w:val="single"/>
-                <w:lang w:val="en-US"/>
-              </w:rPr>
-              <w:t>name</w:t>
-            </w:r>
-            <w:r>
-              <w:rPr>
-                <w:b/>
-                <w:bCs/>
-                <w:u w:val="single"/>
-              </w:rPr>
-              <w:t xml:space="preserve"> }}</w:t>
-            </w:r>
-            <w:r>
-              <w:rPr>
-                <w:b/>
-                <w:bCs/>
-              </w:rPr>
-              <w:t xml:space="preserve"> </w:t>
-            </w:r>
-            <w:r>
-              <w:rPr>
-                <w:b/>
-                <w:bCs/>
-              </w:rPr>
-              <w:t>получил</w:t>
-            </w:r>
-            <w:r>
-              <w:rPr>
-                <w:b/>
-                <w:bCs/>
-              </w:rPr>
-              <w:t>(</w:t>
-            </w:r>
-            <w:r>
-              <w:rPr>
-                <w:b/>
-                <w:bCs/>
-              </w:rPr>
-              <w:t>а</w:t>
-            </w:r>
-            <w:r>
-              <w:rPr>
-                <w:b/>
-                <w:bCs/>
-              </w:rPr>
-              <w:t>)</w:t>
-            </w:r>
-            <w:r>
-              <w:rPr>
-                <w:b/>
-                <w:bCs/>
-              </w:rPr>
-              <w:t xml:space="preserve"> квалификаци</w:t>
-            </w:r>
-            <w:r>
-              <w:rPr>
-                <w:b/>
-                <w:bCs/>
-              </w:rPr>
-              <w:t>ю</w:t>
-            </w:r>
-            <w:r>
-              <w:rPr>
-                <w:b/>
-                <w:bCs/>
-              </w:rPr>
-              <w:t xml:space="preserve"> </w:t>
-            </w:r>
-            <w:r>
-              <w:rPr>
-                <w:b/>
-                <w:bCs/>
-                <w:u w:val="single"/>
-              </w:rPr>
-              <w:t xml:space="preserve">{{ </w:t>
-            </w:r>
-            <w:r>
-              <w:rPr>
-                <w:b/>
-                <w:bCs/>
-                <w:u w:val="single"/>
-                <w:lang w:val="en-US"/>
-              </w:rPr>
-              <w:t>student</w:t>
-            </w:r>
-            <w:r>
-              <w:rPr>
-                <w:b/>
-                <w:bCs/>
-                <w:u w:val="single"/>
-              </w:rPr>
-              <w:t>_</w:t>
-            </w:r>
-            <w:r>
-              <w:rPr>
-                <w:b/>
-                <w:bCs/>
-                <w:u w:val="single"/>
-                <w:lang w:val="en-US"/>
-              </w:rPr>
-              <w:t>profession</w:t>
-            </w:r>
-            <w:r>
-              <w:rPr>
-                <w:b/>
-                <w:bCs/>
-                <w:u w:val="single"/>
-              </w:rPr>
-              <w:t xml:space="preserve"> }}</w:t>
-            </w:r>
-            <w:r>
-              <w:rPr>
-                <w:b/>
-                <w:bCs/>
-                <w:u w:val="single"/>
-              </w:rPr>
-              <w:t xml:space="preserve">,  </w:t>
-            </w:r>
-            <w:r>
-              <w:rPr>
-                <w:b/>
-                <w:bCs/>
-                <w:u w:val="single"/>
-              </w:rPr>
-              <w:t xml:space="preserve">{{ </w:t>
-            </w:r>
-            <w:r>
-              <w:rPr>
-                <w:b/>
-                <w:bCs/>
+                <w:rFonts w:ascii="Times New Roman" w:hAnsi="Times New Roman" w:cs="Times New Roman"/>
+                <w:b/>
+                <w:bCs/>
+                <w:sz w:val="24"/>
+                <w:szCs w:val="24"/>
                 <w:u w:val="single"/>
                 <w:lang w:val="en-US"/>
               </w:rPr>
@@ -793,141 +737,132 @@
             </w:r>
             <w:r>
               <w:rPr>
-                <w:b/>
-                <w:bCs/>
-                <w:u w:val="single"/>
-              </w:rPr>
-              <w:t xml:space="preserve"> }}</w:t>
-            </w:r>
-            <w:r>
-              <w:rPr>
-                <w:b/>
-                <w:bCs/>
-                <w:u w:val="single"/>
-              </w:rPr>
-              <w:t xml:space="preserve"> </w:t>
-            </w:r>
-            <w:r>
-              <w:rPr>
-                <w:b/>
-                <w:bCs/>
+                <w:rFonts w:ascii="Times New Roman" w:hAnsi="Times New Roman" w:cs="Times New Roman"/>
+                <w:b/>
+                <w:bCs/>
+                <w:sz w:val="24"/>
+                <w:szCs w:val="24"/>
+                <w:u w:val="single"/>
+              </w:rPr>
+              <w:t xml:space="preserve"> }} </w:t>
+            </w:r>
+            <w:r>
+              <w:rPr>
+                <w:rFonts w:ascii="Times New Roman" w:hAnsi="Times New Roman" w:cs="Times New Roman"/>
+                <w:b/>
+                <w:bCs/>
+                <w:sz w:val="24"/>
+                <w:szCs w:val="24"/>
                 <w:u w:val="single"/>
               </w:rPr>
               <w:t>разряд</w:t>
             </w:r>
             <w:r>
               <w:rPr>
-                <w:b/>
-                <w:bCs/>
-                <w:u w:val="single"/>
+                <w:rFonts w:ascii="Times New Roman" w:hAnsi="Times New Roman" w:cs="Times New Roman"/>
+                <w:b/>
+                <w:bCs/>
+                <w:sz w:val="24"/>
+                <w:szCs w:val="24"/>
               </w:rPr>
               <w:t>.</w:t>
-            </w:r>
-            <w:r>
-              <w:rPr>
-                <w:b/>
-                <w:bCs/>
-                <w:color w:val="FFFFFF"/>
-                <w:u w:val="single"/>
-              </w:rPr>
-              <w:t xml:space="preserve"> </w:t>
             </w:r>
           </w:p>
           <w:p>
             <w:pPr>
-              <w:pStyle w:val="Standard"/>
-              <w:ind w:right="19"/>
               <w:jc w:val="center"/>
+              <w:rPr>
+                <w:rFonts w:ascii="Times New Roman" w:hAnsi="Times New Roman" w:cs="Times New Roman"/>
+                <w:b/>
+                <w:bCs/>
+                <w:sz w:val="24"/>
+                <w:szCs w:val="24"/>
+              </w:rPr>
             </w:pPr>
             <w:r>
               <w:rPr>
-                <w:b/>
-                <w:bCs/>
+                <w:rFonts w:ascii="Times New Roman" w:hAnsi="Times New Roman" w:cs="Times New Roman"/>
+                <w:b/>
+                <w:bCs/>
+                <w:sz w:val="24"/>
+                <w:szCs w:val="24"/>
               </w:rPr>
               <w:t>Председатель</w:t>
             </w:r>
           </w:p>
           <w:p>
             <w:pPr>
-              <w:pStyle w:val="Standard"/>
-              <w:tabs>
-                <w:tab w:val="left" w:pos="2955"/>
-              </w:tabs>
-              <w:ind w:right="19"/>
               <w:jc w:val="center"/>
               <w:rPr>
-                <w:b/>
-                <w:bCs/>
+                <w:rFonts w:ascii="Times New Roman" w:hAnsi="Times New Roman" w:cs="Times New Roman"/>
+                <w:b/>
+                <w:bCs/>
+                <w:sz w:val="24"/>
+                <w:szCs w:val="24"/>
               </w:rPr>
             </w:pPr>
             <w:r>
               <w:rPr>
-                <w:b/>
-                <w:bCs/>
-              </w:rPr>
-              <w:t>квалификационной комиссии</w:t>
+                <w:rFonts w:ascii="Times New Roman" w:hAnsi="Times New Roman" w:cs="Times New Roman"/>
+                <w:b/>
+                <w:bCs/>
+                <w:sz w:val="24"/>
+                <w:szCs w:val="24"/>
+              </w:rPr>
+              <w:t>к</w:t>
+            </w:r>
+            <w:r>
+              <w:rPr>
+                <w:rFonts w:ascii="Times New Roman" w:hAnsi="Times New Roman" w:cs="Times New Roman"/>
+                <w:b/>
+                <w:bCs/>
+                <w:sz w:val="24"/>
+                <w:szCs w:val="24"/>
+              </w:rPr>
+              <w:t>валификационной комиссии</w:t>
             </w:r>
           </w:p>
           <w:p>
             <w:pPr>
-              <w:pStyle w:val="Standard"/>
-              <w:tabs>
-                <w:tab w:val="left" w:pos="2955"/>
-              </w:tabs>
-              <w:ind w:right="19"/>
               <w:jc w:val="center"/>
               <w:rPr>
-                <w:b/>
-                <w:bCs/>
+                <w:rFonts w:ascii="Times New Roman" w:hAnsi="Times New Roman" w:cs="Times New Roman"/>
+                <w:b/>
+                <w:bCs/>
+                <w:sz w:val="24"/>
+                <w:szCs w:val="24"/>
               </w:rPr>
             </w:pPr>
             <w:r>
               <w:rPr>
-                <w:b/>
-                <w:bCs/>
+                <w:rFonts w:ascii="Times New Roman" w:hAnsi="Times New Roman" w:cs="Times New Roman"/>
+                <w:b/>
+                <w:bCs/>
+                <w:sz w:val="24"/>
+                <w:szCs w:val="24"/>
               </w:rPr>
               <w:t>Директор</w:t>
             </w:r>
           </w:p>
           <w:p>
             <w:pPr>
-              <w:pStyle w:val="Heading1"/>
-              <w:keepLines w:val="0"/>
-              <w:numPr>
-                <w:ilvl w:val="0"/>
-                <w:numId w:val="2"/>
-              </w:numPr>
-              <w:tabs>
-                <w:tab w:val="left" w:pos="2955"/>
-              </w:tabs>
-              <w:suppressAutoHyphens/>
-              <w:spacing w:before="0"/>
-              <w:ind w:right="19" w:firstLine="284"/>
-              <w:rPr>
-                <w:rFonts w:ascii="Times New Roman" w:eastAsia="Calibri" w:hAnsi="Times New Roman" w:cs="Times New Roman"/>
-                <w:b/>
-                <w:bCs/>
-                <w:sz w:val="24"/>
+              <w:ind w:right="213"/>
+              <w:jc w:val="right"/>
+              <w:rPr>
+                <w:rFonts w:ascii="Times New Roman" w:hAnsi="Times New Roman" w:cs="Times New Roman"/>
+                <w:b/>
+                <w:bCs/>
+                <w:sz w:val="24"/>
+                <w:szCs w:val="24"/>
+                <w:lang w:val="en-US"/>
               </w:rPr>
             </w:pPr>
-            <w:r>
-              <w:rPr>
-                <w:rFonts w:ascii="Times New Roman" w:hAnsi="Times New Roman" w:cs="Times New Roman"/>
-                <w:b/>
-                <w:bCs/>
-                <w:color w:val="auto"/>
-                <w:sz w:val="24"/>
-                <w:szCs w:val="24"/>
-              </w:rPr>
-              <w:t xml:space="preserve">                                                                           </w:t>
-            </w:r>
             <w:proofErr w:type="gramStart"/>
             <w:r>
               <w:rPr>
                 <w:rFonts w:ascii="Times New Roman" w:hAnsi="Times New Roman" w:cs="Times New Roman"/>
                 <w:b/>
                 <w:bCs/>
-                <w:color w:val="auto"/>
                 <w:sz w:val="24"/>
                 <w:szCs w:val="24"/>
                 <w:lang w:val="en-US"/>
@@ -940,7 +875,6 @@
                 <w:rFonts w:ascii="Times New Roman" w:hAnsi="Times New Roman" w:cs="Times New Roman"/>
                 <w:b/>
                 <w:bCs/>
-                <w:color w:val="auto"/>
                 <w:sz w:val="24"/>
                 <w:szCs w:val="24"/>
                 <w:lang w:val="en-US"/>
@@ -953,7 +887,6 @@
                 <w:rFonts w:ascii="Times New Roman" w:hAnsi="Times New Roman" w:cs="Times New Roman"/>
                 <w:b/>
                 <w:bCs/>
-                <w:color w:val="auto"/>
                 <w:sz w:val="24"/>
                 <w:szCs w:val="24"/>
                 <w:lang w:val="en-US"/>
@@ -966,7 +899,6 @@
                 <w:rFonts w:ascii="Times New Roman" w:hAnsi="Times New Roman" w:cs="Times New Roman"/>
                 <w:b/>
                 <w:bCs/>
-                <w:color w:val="auto"/>
                 <w:sz w:val="24"/>
                 <w:szCs w:val="24"/>
                 <w:lang w:val="en-US"/>
@@ -976,17 +908,25 @@
           </w:p>
           <w:p>
             <w:pPr>
-              <w:ind w:firstLine="284"/>
-              <w:rPr>
-                <w:rFonts w:ascii="Times New Roman" w:eastAsia="Calibri" w:hAnsi="Times New Roman" w:cs="Times New Roman"/>
-                <w:sz w:val="24"/>
+              <w:rPr>
+                <w:rFonts w:ascii="Times New Roman" w:hAnsi="Times New Roman" w:cs="Times New Roman"/>
+                <w:sz w:val="24"/>
+                <w:szCs w:val="24"/>
               </w:rPr>
             </w:pPr>
           </w:p>
         </w:tc>
       </w:tr>
     </w:tbl>
-    <w:p/>
+    <w:p>
+      <w:pPr>
+        <w:rPr>
+          <w:rFonts w:ascii="Times New Roman" w:hAnsi="Times New Roman" w:cs="Times New Roman"/>
+          <w:sz w:val="24"/>
+          <w:szCs w:val="24"/>
+        </w:rPr>
+      </w:pPr>
+    </w:p>
     <w:sectPr>
       <w:pgSz w:w="11906" w:h="16838"/>
       <w:pgMar w:top="284" w:right="850" w:bottom="284" w:left="1701" w:header="708" w:footer="708" w:gutter="0"/>

</xml_diff>

<commit_message>
updates certificate with the right conj
</commit_message>
<xml_diff>
--- a/templates/свидетельство.docx
+++ b/templates/свидетельство.docx
@@ -123,9 +123,8 @@
                 <w:sz w:val="24"/>
                 <w:szCs w:val="24"/>
               </w:rPr>
-              <w:t xml:space="preserve"> № {{ </w:t>
-            </w:r>
-            <w:proofErr w:type="spellStart"/>
+              <w:t xml:space="preserve"> № </w:t>
+            </w:r>
             <w:proofErr w:type="gramStart"/>
             <w:r>
               <w:rPr>
@@ -134,11 +133,20 @@
                 <w:bCs/>
                 <w:sz w:val="24"/>
                 <w:szCs w:val="24"/>
+              </w:rPr>
+              <w:t xml:space="preserve">{{ </w:t>
+            </w:r>
+            <w:r>
+              <w:rPr>
+                <w:rFonts w:ascii="Times New Roman" w:hAnsi="Times New Roman" w:cs="Times New Roman"/>
+                <w:b/>
+                <w:bCs/>
+                <w:sz w:val="24"/>
+                <w:szCs w:val="24"/>
                 <w:lang w:val="en-US"/>
               </w:rPr>
               <w:t>certificate</w:t>
             </w:r>
-            <w:proofErr w:type="spellEnd"/>
             <w:proofErr w:type="gramEnd"/>
             <w:r>
               <w:rPr>
@@ -150,7 +158,6 @@
               </w:rPr>
               <w:t>_</w:t>
             </w:r>
-            <w:proofErr w:type="spellStart"/>
             <w:r>
               <w:rPr>
                 <w:rFonts w:ascii="Times New Roman" w:hAnsi="Times New Roman" w:cs="Times New Roman"/>
@@ -162,7 +169,6 @@
               </w:rPr>
               <w:t>number</w:t>
             </w:r>
-            <w:proofErr w:type="spellEnd"/>
             <w:r>
               <w:rPr>
                 <w:rFonts w:ascii="Times New Roman" w:hAnsi="Times New Roman" w:cs="Times New Roman"/>
@@ -229,7 +235,6 @@
                 <w:u w:val="single"/>
               </w:rPr>
             </w:pPr>
-            <w:proofErr w:type="gramStart"/>
             <w:r>
               <w:rPr>
                 <w:rFonts w:ascii="Times New Roman" w:hAnsi="Times New Roman" w:cs="Times New Roman"/>
@@ -253,7 +258,6 @@
               </w:rPr>
               <w:t>student</w:t>
             </w:r>
-            <w:proofErr w:type="gramEnd"/>
             <w:r>
               <w:rPr>
                 <w:rFonts w:ascii="Times New Roman" w:hAnsi="Times New Roman" w:cs="Times New Roman"/>
@@ -320,18 +324,7 @@
                 <w:sz w:val="24"/>
                 <w:szCs w:val="24"/>
               </w:rPr>
-              <w:t xml:space="preserve"> </w:t>
-            </w:r>
-            <w:proofErr w:type="gramStart"/>
-            <w:r>
-              <w:rPr>
-                <w:rFonts w:ascii="Times New Roman" w:hAnsi="Times New Roman" w:cs="Times New Roman"/>
-                <w:b/>
-                <w:bCs/>
-                <w:sz w:val="24"/>
-                <w:szCs w:val="24"/>
-              </w:rPr>
-              <w:t xml:space="preserve">{{ </w:t>
+              <w:t xml:space="preserve"> {{ </w:t>
             </w:r>
             <w:r>
               <w:rPr>
@@ -344,7 +337,6 @@
               </w:rPr>
               <w:t>beginning</w:t>
             </w:r>
-            <w:proofErr w:type="gramEnd"/>
             <w:r>
               <w:rPr>
                 <w:rFonts w:ascii="Times New Roman" w:hAnsi="Times New Roman" w:cs="Times New Roman"/>
@@ -416,7 +408,27 @@
                 <w:sz w:val="24"/>
                 <w:szCs w:val="24"/>
               </w:rPr>
-              <w:t xml:space="preserve"> }} окончил(а) курсы по программе профессиональное подготовки по профессии </w:t>
+              <w:t xml:space="preserve"> }} окончил(а) курсы по программе профессионально</w:t>
+            </w:r>
+            <w:r>
+              <w:rPr>
+                <w:rFonts w:ascii="Times New Roman" w:hAnsi="Times New Roman" w:cs="Times New Roman"/>
+                <w:b/>
+                <w:bCs/>
+                <w:sz w:val="24"/>
+                <w:szCs w:val="24"/>
+              </w:rPr>
+              <w:t>й</w:t>
+            </w:r>
+            <w:r>
+              <w:rPr>
+                <w:rFonts w:ascii="Times New Roman" w:hAnsi="Times New Roman" w:cs="Times New Roman"/>
+                <w:b/>
+                <w:bCs/>
+                <w:sz w:val="24"/>
+                <w:szCs w:val="24"/>
+              </w:rPr>
+              <w:t xml:space="preserve"> подготовки по профессии </w:t>
             </w:r>
             <w:r>
               <w:rPr>
@@ -651,7 +663,6 @@
               </w:rPr>
               <w:t xml:space="preserve">{{ </w:t>
             </w:r>
-            <w:proofErr w:type="spellStart"/>
             <w:r>
               <w:rPr>
                 <w:rFonts w:ascii="Times New Roman" w:hAnsi="Times New Roman" w:cs="Times New Roman"/>
@@ -664,7 +675,6 @@
               </w:rPr>
               <w:t>student</w:t>
             </w:r>
-            <w:proofErr w:type="spellEnd"/>
             <w:r>
               <w:rPr>
                 <w:rFonts w:ascii="Times New Roman" w:hAnsi="Times New Roman" w:cs="Times New Roman"/>
@@ -676,7 +686,6 @@
               </w:rPr>
               <w:t>_</w:t>
             </w:r>
-            <w:proofErr w:type="spellStart"/>
             <w:r>
               <w:rPr>
                 <w:rFonts w:ascii="Times New Roman" w:hAnsi="Times New Roman" w:cs="Times New Roman"/>
@@ -689,7 +698,6 @@
               </w:rPr>
               <w:t>profession</w:t>
             </w:r>
-            <w:proofErr w:type="spellEnd"/>
             <w:r>
               <w:rPr>
                 <w:rFonts w:ascii="Times New Roman" w:hAnsi="Times New Roman" w:cs="Times New Roman"/>

</xml_diff>